<commit_message>
Pieniä muutoksia, tyyliohje päivitetty ja lopullinen css tiedosto luotu
</commit_message>
<xml_diff>
--- a/Projutiedostot/Tyyliohje.docx
+++ b/Projutiedostot/Tyyliohje.docx
@@ -4,28 +4,23 @@
   <w:body>
     <w:p>
       <w:pPr>
-        <w:pStyle w:val="Otsikko"/>
+        <w:pStyle w:val="Title"/>
         <w:jc w:val="center"/>
       </w:pPr>
       <w:r>
-        <w:t xml:space="preserve">Tyyliohje ja Design </w:t>
-      </w:r>
-      <w:proofErr w:type="spellStart"/>
-      <w:r>
-        <w:t>Rationale</w:t>
-      </w:r>
-      <w:proofErr w:type="spellEnd"/>
-    </w:p>
-    <w:p>
-      <w:pPr>
-        <w:pStyle w:val="Otsikko"/>
+        <w:t>Tyyliohje ja Design Rationale</w:t>
+      </w:r>
+    </w:p>
+    <w:p>
+      <w:pPr>
+        <w:pStyle w:val="Title"/>
         <w:jc w:val="center"/>
       </w:pPr>
     </w:p>
     <w:p/>
     <w:p>
       <w:pPr>
-        <w:pStyle w:val="Otsikko1"/>
+        <w:pStyle w:val="Heading1"/>
       </w:pPr>
       <w:r>
         <w:t>1 Tyyliohje</w:t>
@@ -34,7 +29,7 @@
     <w:p/>
     <w:p>
       <w:pPr>
-        <w:pStyle w:val="Otsikko2"/>
+        <w:pStyle w:val="Heading2"/>
       </w:pPr>
       <w:r>
         <w:t>1.1 Lyhyesti tyyliohjeesta</w:t>
@@ -46,149 +41,237 @@
         <w:t>Tyyliohje osuudessa määritämme sivuston v</w:t>
       </w:r>
       <w:r>
-        <w:t xml:space="preserve">ärit, fontit, </w:t>
-      </w:r>
-      <w:proofErr w:type="spellStart"/>
-      <w:r>
-        <w:t>eriaiset</w:t>
-      </w:r>
-      <w:proofErr w:type="spellEnd"/>
-      <w:r>
-        <w:t xml:space="preserve"> komponentit (mm: kor</w:t>
+        <w:t>ärit, fontit, eriaiset komponentit (mm: kor</w:t>
       </w:r>
       <w:r>
         <w:t>tit</w:t>
       </w:r>
       <w:r>
-        <w:t xml:space="preserve">, </w:t>
-      </w:r>
-      <w:proofErr w:type="spellStart"/>
-      <w:r>
-        <w:t>headerit</w:t>
-      </w:r>
-      <w:proofErr w:type="spellEnd"/>
-      <w:r>
-        <w:t xml:space="preserve">, </w:t>
-      </w:r>
-      <w:proofErr w:type="spellStart"/>
-      <w:r>
-        <w:t>footerit</w:t>
-      </w:r>
-      <w:proofErr w:type="spellEnd"/>
+        <w:t xml:space="preserve">, headerit, footerit </w:t>
+      </w:r>
+      <w:r>
+        <w:t>ja kontaktiformit</w:t>
+      </w:r>
+      <w:r>
+        <w:t>). Osuuden tarkoitus on antaa yleiset ohjeet  erillisten osien käyttöön.</w:t>
+      </w:r>
+    </w:p>
+    <w:p/>
+    <w:p>
+      <w:pPr>
+        <w:pStyle w:val="Heading2"/>
+      </w:pPr>
+      <w:r>
+        <w:t>1.2 Sivuston värimaailma</w:t>
+      </w:r>
+    </w:p>
+    <w:p/>
+    <w:p>
+      <w:r>
+        <w:t>Yleisen ulkoasun tulee olla he</w:t>
+      </w:r>
+      <w:r>
+        <w:t>lposti luettava ja värimaailma pitää heijastaa yrityksen brändi imagoa. Sivun taustaväri on rgb (2</w:t>
+      </w:r>
+      <w:r>
+        <w:t>45</w:t>
+      </w:r>
+      <w:r>
+        <w:t>,</w:t>
+      </w:r>
       <w:r>
         <w:t xml:space="preserve"> </w:t>
       </w:r>
       <w:r>
-        <w:t xml:space="preserve">ja </w:t>
-      </w:r>
-      <w:proofErr w:type="spellStart"/>
-      <w:r>
-        <w:t>kontaktiformit</w:t>
-      </w:r>
-      <w:proofErr w:type="spellEnd"/>
-      <w:r>
-        <w:t>). Osuuden tarkoitus on antaa yleiset ohjeet  erillisten osien käyttöön.</w:t>
+        <w:t>2</w:t>
+      </w:r>
+      <w:r>
+        <w:t>45</w:t>
+      </w:r>
+      <w:r>
+        <w:t>,</w:t>
+      </w:r>
+      <w:r>
+        <w:t xml:space="preserve"> </w:t>
+      </w:r>
+      <w:r>
+        <w:t>2</w:t>
+      </w:r>
+      <w:r>
+        <w:t>45</w:t>
+      </w:r>
+      <w:r>
+        <w:t xml:space="preserve">). Ns korostevärinä on rgb (11, 159, 196). Kaikki muut värit ovat joko mustaa tai valkoista. </w:t>
       </w:r>
     </w:p>
     <w:p/>
     <w:p>
       <w:pPr>
-        <w:pStyle w:val="Otsikko2"/>
-      </w:pPr>
-      <w:r>
-        <w:t>1.2 Sivuston värimaailma</w:t>
+        <w:pStyle w:val="Heading2"/>
+      </w:pPr>
+      <w:r>
+        <w:t>1.3 Typografia (fontit</w:t>
+      </w:r>
+      <w:r>
+        <w:t>, koot ja headerit</w:t>
+      </w:r>
+      <w:r>
+        <w:t>)</w:t>
       </w:r>
     </w:p>
     <w:p/>
     <w:p>
       <w:r>
-        <w:t>Yleisen ulkoasun tulee olla he</w:t>
-      </w:r>
-      <w:r>
-        <w:t xml:space="preserve">lposti luettava ja värimaailma pitää heijastaa yrityksen brändi imagoa. Sivun taustaväri on </w:t>
-      </w:r>
-      <w:proofErr w:type="spellStart"/>
-      <w:r>
-        <w:t>rgb</w:t>
-      </w:r>
-      <w:proofErr w:type="spellEnd"/>
-      <w:r>
-        <w:t xml:space="preserve"> (211,211,211). </w:t>
-      </w:r>
-      <w:proofErr w:type="spellStart"/>
-      <w:r>
-        <w:t>Ns</w:t>
-      </w:r>
-      <w:proofErr w:type="spellEnd"/>
-      <w:r>
-        <w:t xml:space="preserve"> korostevärinä on </w:t>
-      </w:r>
-      <w:proofErr w:type="spellStart"/>
-      <w:r>
-        <w:t>rgb</w:t>
-      </w:r>
-      <w:proofErr w:type="spellEnd"/>
-      <w:r>
-        <w:t xml:space="preserve"> (11, 159, 196). Kaikki muut värit ovat joko mustaa tai valkoista. </w:t>
+        <w:t>Koko sivuston fontti Sans Serif</w:t>
+      </w:r>
+    </w:p>
+    <w:p>
+      <w:pPr>
+        <w:rPr>
+          <w:rFonts w:cs="Sans Serif Collection"/>
+        </w:rPr>
+      </w:pPr>
+      <w:r>
+        <w:rPr>
+          <w:rFonts w:cs="Sans Serif Collection"/>
+        </w:rPr>
+        <w:t xml:space="preserve">Leipäteksti </w:t>
+      </w:r>
+      <w:r>
+        <w:rPr>
+          <w:rFonts w:cs="Sans Serif Collection"/>
+        </w:rPr>
+        <w:t>koko 25px</w:t>
+      </w:r>
+    </w:p>
+    <w:p>
+      <w:pPr>
+        <w:rPr>
+          <w:rFonts w:cs="Sans Serif Collection"/>
+        </w:rPr>
+      </w:pPr>
+      <w:r>
+        <w:rPr>
+          <w:rFonts w:cs="Sans Serif Collection"/>
+        </w:rPr>
+        <w:t>Otsikoiden koko pidetään oletusarvossa</w:t>
+      </w:r>
+    </w:p>
+    <w:p>
+      <w:pPr>
+        <w:rPr>
+          <w:rFonts w:cs="Sans Serif Collection"/>
+        </w:rPr>
+      </w:pPr>
+      <w:r>
+        <w:rPr>
+          <w:rFonts w:cs="Sans Serif Collection"/>
+        </w:rPr>
+        <w:t>Korttien teksti 18px</w:t>
+      </w:r>
+    </w:p>
+    <w:p>
+      <w:pPr>
+        <w:rPr>
+          <w:rFonts w:cs="Sans Serif Collection"/>
+        </w:rPr>
+      </w:pPr>
+      <w:r>
+        <w:rPr>
+          <w:rFonts w:cs="Sans Serif Collection"/>
+        </w:rPr>
+        <w:t>Lomakkeissa 18px</w:t>
+      </w:r>
+    </w:p>
+    <w:p>
+      <w:pPr>
+        <w:rPr>
+          <w:rFonts w:cs="Sans Serif Collection"/>
+          <w:lang w:val="en-US"/>
+        </w:rPr>
+      </w:pPr>
+      <w:r>
+        <w:rPr>
+          <w:rFonts w:cs="Sans Serif Collection"/>
+          <w:lang w:val="en-US"/>
+        </w:rPr>
+        <w:t xml:space="preserve">Header 25px </w:t>
+      </w:r>
+    </w:p>
+    <w:p>
+      <w:pPr>
+        <w:rPr>
+          <w:rFonts w:cs="Sans Serif Collection"/>
+        </w:rPr>
+      </w:pPr>
+      <w:r>
+        <w:rPr>
+          <w:rFonts w:cs="Sans Serif Collection"/>
+        </w:rPr>
+        <w:t>F</w:t>
+      </w:r>
+      <w:r>
+        <w:rPr>
+          <w:rFonts w:cs="Sans Serif Collection"/>
+        </w:rPr>
+        <w:t>ooter</w:t>
+      </w:r>
+      <w:r>
+        <w:rPr>
+          <w:rFonts w:cs="Sans Serif Collection"/>
+        </w:rPr>
+        <w:t xml:space="preserve"> 18px (tarvittaessa tärkeät i</w:t>
+      </w:r>
+      <w:r>
+        <w:rPr>
+          <w:rFonts w:cs="Sans Serif Collection"/>
+        </w:rPr>
+        <w:t>nfot koolla 25px)</w:t>
       </w:r>
     </w:p>
     <w:p/>
     <w:p>
       <w:pPr>
-        <w:pStyle w:val="Otsikko2"/>
-      </w:pPr>
-      <w:r>
-        <w:t>1.3 Typografia (fontit)</w:t>
+        <w:pStyle w:val="Heading2"/>
+      </w:pPr>
+      <w:r>
+        <w:lastRenderedPageBreak/>
+        <w:t>1.4 Komponentit</w:t>
       </w:r>
     </w:p>
     <w:p/>
     <w:p>
       <w:r>
-        <w:t>-Konsultoi Milaa tästä vielä</w:t>
+        <w:t>Jokaisella komponentilla on oma paikka ja suunnittelu. Esimerkki komponenteille on annettu omat aliotsikot, jossa kerrotaan lyhyesti komponentista ja sen ulkonäöstä ja käytettävyydestä.</w:t>
       </w:r>
     </w:p>
     <w:p/>
     <w:p>
       <w:pPr>
-        <w:pStyle w:val="Otsikko2"/>
-      </w:pPr>
-      <w:r>
-        <w:t>1.4 Komponentit</w:t>
+        <w:pStyle w:val="Heading3"/>
+      </w:pPr>
+      <w:r>
+        <w:t>1.4.1 Kortit</w:t>
       </w:r>
     </w:p>
     <w:p/>
     <w:p>
       <w:r>
-        <w:t>Jokaisella komponentilla on oma paikka ja suunnittelu. Esimerkki komponenteille on annettu omat aliotsikot, jossa kerrotaan lyhyesti komponentista ja sen ulkonäöstä ja käytettävyydestä.</w:t>
-      </w:r>
-    </w:p>
-    <w:p/>
-    <w:p>
-      <w:pPr>
-        <w:pStyle w:val="Otsikko3"/>
-      </w:pPr>
-      <w:r>
-        <w:lastRenderedPageBreak/>
-        <w:t>1.4.1 Kortit</w:t>
-      </w:r>
-    </w:p>
-    <w:p/>
-    <w:p>
-      <w:r>
-        <w:t xml:space="preserve">Kortit antavat infoa käytännöllisessä ja helposti luettavassa pienessä paketissa. Kortissa olevan kuvan pitää skaalautua hyvin kokoon, jotta se ei ole liian sotkuinen ja yllä oleva </w:t>
-      </w:r>
-      <w:proofErr w:type="spellStart"/>
-      <w:r>
-        <w:t>container</w:t>
-      </w:r>
-      <w:proofErr w:type="spellEnd"/>
-      <w:r>
-        <w:t xml:space="preserve"> teksti ei saa olla liian pitkää. Kortissa seurataan aiemmin mainittuja väri ja fontti valintoja. Alla esimerkkinä etusivun kortit:</w:t>
-      </w:r>
-    </w:p>
-    <w:p>
-      <w:pPr>
-        <w:pStyle w:val="Otsikko"/>
+        <w:t>Kortit antavat infoa käytännöllisessä ja helposti luettavassa pienessä paketissa. Kortissa olevan kuvan pitää skaalautua hyvin kokoon, jotta se ei ole liian sotkuinen ja yllä oleva container teksti ei saa olla liian pitkää. Kortissa seurataan aiemmin mainittuja väri ja fontti valintoja.</w:t>
+      </w:r>
+      <w:r>
+        <w:t xml:space="preserve"> Korttien koko on noin 300px x 450px, korkeutta voi säätää tarvittaessa.</w:t>
+      </w:r>
+      <w:r>
+        <w:t xml:space="preserve"> Kaikkien korttien otsikko on joko containerissa päällä tai taustalla.</w:t>
+      </w:r>
+      <w:r>
+        <w:t xml:space="preserve"> Alla esimerkkinä etusivun kortit:</w:t>
+      </w:r>
+    </w:p>
+    <w:p>
+      <w:pPr>
+        <w:pStyle w:val="Title"/>
         <w:jc w:val="center"/>
       </w:pPr>
       <w:r>
@@ -247,91 +330,150 @@
     </w:p>
     <w:p>
       <w:pPr>
-        <w:pStyle w:val="Otsikko"/>
-      </w:pPr>
-    </w:p>
-    <w:p>
-      <w:pPr>
-        <w:pStyle w:val="Otsikko3"/>
-      </w:pPr>
-      <w:r>
-        <w:t xml:space="preserve">1.4.2 </w:t>
+        <w:pStyle w:val="Title"/>
+      </w:pPr>
+    </w:p>
+    <w:p>
+      <w:pPr>
+        <w:pStyle w:val="Heading3"/>
+      </w:pPr>
+      <w:r>
+        <w:t>1.4.2 Header</w:t>
+      </w:r>
+    </w:p>
+    <w:p/>
+    <w:p>
+      <w:r>
+        <w:t>Headerin suunnittelu on todella tärkeää, sen pitää toimia hyvänä ja toimivana navigaatiopalkkina kaikilla sivuston sivuilla ja myös tuoda yrityksen logoa esille.</w:t>
+      </w:r>
+    </w:p>
+    <w:p/>
+    <w:p>
+      <w:r>
+        <w:t>#Headerin design ei vielä kiveen hakattu joten lisään myöhemmin infoa.</w:t>
+      </w:r>
+    </w:p>
+    <w:p/>
+    <w:p>
+      <w:pPr>
+        <w:pStyle w:val="Heading3"/>
+        <w:rPr>
+          <w:lang w:val="en-US"/>
+        </w:rPr>
+      </w:pPr>
+      <w:proofErr w:type="gramStart"/>
+      <w:r>
+        <w:rPr>
+          <w:lang w:val="en-US"/>
+        </w:rPr>
+        <w:t>1.4.3 Footer</w:t>
+      </w:r>
+      <w:proofErr w:type="gramEnd"/>
+    </w:p>
+    <w:p>
+      <w:pPr>
+        <w:rPr>
+          <w:lang w:val="en-US"/>
+        </w:rPr>
+      </w:pPr>
+    </w:p>
+    <w:p>
+      <w:pPr>
+        <w:rPr>
+          <w:lang w:val="en-US"/>
+        </w:rPr>
+      </w:pPr>
+      <w:r>
+        <w:rPr>
+          <w:lang w:val="en-US"/>
+        </w:rPr>
+        <w:t xml:space="preserve">#kts </w:t>
       </w:r>
       <w:proofErr w:type="spellStart"/>
       <w:r>
-        <w:t>Header</w:t>
+        <w:rPr>
+          <w:lang w:val="en-US"/>
+        </w:rPr>
+        <w:t>ylempi</w:t>
       </w:r>
       <w:proofErr w:type="spellEnd"/>
-    </w:p>
-    <w:p/>
-    <w:p>
+      <w:r>
+        <w:rPr>
+          <w:lang w:val="en-US"/>
+        </w:rPr>
+        <w:t xml:space="preserve"> </w:t>
+      </w:r>
       <w:proofErr w:type="spellStart"/>
       <w:r>
-        <w:t>Headerin</w:t>
+        <w:rPr>
+          <w:lang w:val="en-US"/>
+        </w:rPr>
+        <w:t>nootti</w:t>
       </w:r>
       <w:proofErr w:type="spellEnd"/>
-      <w:r>
-        <w:t xml:space="preserve"> suunnittelu on todella tärkeää, sen pitää toimia hyvänä ja toimivana navigaatiopalkkina kaikilla sivuston sivuilla ja myös tuoda yrityksen logoa esille.</w:t>
-      </w:r>
-    </w:p>
-    <w:p/>
-    <w:p>
-      <w:r>
-        <w:t xml:space="preserve">#Headerin design ei vielä kiveen </w:t>
-      </w:r>
-      <w:proofErr w:type="gramStart"/>
-      <w:r>
-        <w:t>hakattu</w:t>
-      </w:r>
-      <w:proofErr w:type="gramEnd"/>
-      <w:r>
-        <w:t xml:space="preserve"> joten lisään myöhemmin infoa.</w:t>
-      </w:r>
-    </w:p>
-    <w:p/>
-    <w:p>
-      <w:pPr>
-        <w:pStyle w:val="Otsikko3"/>
-      </w:pPr>
-      <w:r>
-        <w:t xml:space="preserve">1.4.3 </w:t>
-      </w:r>
-      <w:proofErr w:type="spellStart"/>
-      <w:r>
-        <w:t>Footer</w:t>
-      </w:r>
-      <w:proofErr w:type="spellEnd"/>
-    </w:p>
-    <w:p/>
-    <w:p>
-      <w:r>
-        <w:t>#kts ylempi nootti</w:t>
-      </w:r>
-    </w:p>
-    <w:p/>
-    <w:p>
-      <w:pPr>
-        <w:pStyle w:val="Otsikko3"/>
-      </w:pPr>
-      <w:r>
-        <w:t xml:space="preserve">1.4.4 </w:t>
-      </w:r>
-      <w:proofErr w:type="spellStart"/>
-      <w:r>
-        <w:t>Forms</w:t>
-      </w:r>
-      <w:proofErr w:type="spellEnd"/>
-    </w:p>
-    <w:p/>
-    <w:p>
-      <w:r>
-        <w:lastRenderedPageBreak/>
+    </w:p>
+    <w:p>
+      <w:pPr>
+        <w:rPr>
+          <w:lang w:val="en-US"/>
+        </w:rPr>
+      </w:pPr>
+    </w:p>
+    <w:p>
+      <w:pPr>
+        <w:pStyle w:val="Heading3"/>
+        <w:rPr>
+          <w:lang w:val="en-US"/>
+        </w:rPr>
+      </w:pPr>
+      <w:r>
+        <w:rPr>
+          <w:lang w:val="en-US"/>
+        </w:rPr>
+        <w:t>1.4.4 Forms</w:t>
+      </w:r>
+    </w:p>
+    <w:p>
+      <w:pPr>
+        <w:rPr>
+          <w:lang w:val="en-US"/>
+        </w:rPr>
+      </w:pPr>
+    </w:p>
+    <w:p>
+      <w:pPr>
+        <w:rPr>
+          <w:lang w:val="en-US"/>
+        </w:rPr>
+      </w:pPr>
+      <w:r>
+        <w:rPr>
+          <w:lang w:val="en-US"/>
+        </w:rPr>
         <w:t># --II—</w:t>
       </w:r>
     </w:p>
-    <w:p/>
-    <w:p/>
-    <w:p/>
+    <w:p>
+      <w:pPr>
+        <w:rPr>
+          <w:lang w:val="en-US"/>
+        </w:rPr>
+      </w:pPr>
+    </w:p>
+    <w:p>
+      <w:pPr>
+        <w:rPr>
+          <w:lang w:val="en-US"/>
+        </w:rPr>
+      </w:pPr>
+    </w:p>
+    <w:p>
+      <w:pPr>
+        <w:rPr>
+          <w:lang w:val="en-US"/>
+        </w:rPr>
+      </w:pPr>
+    </w:p>
     <w:sectPr>
       <w:pgSz w:w="11906" w:h="16838"/>
       <w:pgMar w:top="1440" w:right="1440" w:bottom="1440" w:left="1440" w:header="708" w:footer="708" w:gutter="0"/>
@@ -739,18 +881,18 @@
     <w:lsdException w:name="Unresolved Mention" w:semiHidden="1" w:unhideWhenUsed="1"/>
     <w:lsdException w:name="Smart Link" w:semiHidden="1" w:unhideWhenUsed="1"/>
   </w:latentStyles>
-  <w:style w:type="paragraph" w:default="1" w:styleId="Normaali">
+  <w:style w:type="paragraph" w:default="1" w:styleId="Normal">
     <w:name w:val="Normal"/>
     <w:qFormat/>
     <w:rPr>
       <w:lang w:val="fi-FI"/>
     </w:rPr>
   </w:style>
-  <w:style w:type="paragraph" w:styleId="Otsikko1">
+  <w:style w:type="paragraph" w:styleId="Heading1">
     <w:name w:val="heading 1"/>
-    <w:basedOn w:val="Normaali"/>
-    <w:next w:val="Normaali"/>
-    <w:link w:val="Otsikko1Char"/>
+    <w:basedOn w:val="Normal"/>
+    <w:next w:val="Normal"/>
+    <w:link w:val="Heading1Char"/>
     <w:uiPriority w:val="9"/>
     <w:qFormat/>
     <w:rsid w:val="00523D16"/>
@@ -767,11 +909,11 @@
       <w:szCs w:val="40"/>
     </w:rPr>
   </w:style>
-  <w:style w:type="paragraph" w:styleId="Otsikko2">
+  <w:style w:type="paragraph" w:styleId="Heading2">
     <w:name w:val="heading 2"/>
-    <w:basedOn w:val="Normaali"/>
-    <w:next w:val="Normaali"/>
-    <w:link w:val="Otsikko2Char"/>
+    <w:basedOn w:val="Normal"/>
+    <w:next w:val="Normal"/>
+    <w:link w:val="Heading2Char"/>
     <w:uiPriority w:val="9"/>
     <w:unhideWhenUsed/>
     <w:qFormat/>
@@ -789,11 +931,11 @@
       <w:szCs w:val="32"/>
     </w:rPr>
   </w:style>
-  <w:style w:type="paragraph" w:styleId="Otsikko3">
+  <w:style w:type="paragraph" w:styleId="Heading3">
     <w:name w:val="heading 3"/>
-    <w:basedOn w:val="Normaali"/>
-    <w:next w:val="Normaali"/>
-    <w:link w:val="Otsikko3Char"/>
+    <w:basedOn w:val="Normal"/>
+    <w:next w:val="Normal"/>
+    <w:link w:val="Heading3Char"/>
     <w:uiPriority w:val="9"/>
     <w:unhideWhenUsed/>
     <w:qFormat/>
@@ -811,11 +953,11 @@
       <w:szCs w:val="28"/>
     </w:rPr>
   </w:style>
-  <w:style w:type="paragraph" w:styleId="Otsikko4">
+  <w:style w:type="paragraph" w:styleId="Heading4">
     <w:name w:val="heading 4"/>
-    <w:basedOn w:val="Normaali"/>
-    <w:next w:val="Normaali"/>
-    <w:link w:val="Otsikko4Char"/>
+    <w:basedOn w:val="Normal"/>
+    <w:next w:val="Normal"/>
+    <w:link w:val="Heading4Char"/>
     <w:uiPriority w:val="9"/>
     <w:semiHidden/>
     <w:unhideWhenUsed/>
@@ -834,11 +976,11 @@
       <w:color w:val="0F4761" w:themeColor="accent1" w:themeShade="BF"/>
     </w:rPr>
   </w:style>
-  <w:style w:type="paragraph" w:styleId="Otsikko5">
+  <w:style w:type="paragraph" w:styleId="Heading5">
     <w:name w:val="heading 5"/>
-    <w:basedOn w:val="Normaali"/>
-    <w:next w:val="Normaali"/>
-    <w:link w:val="Otsikko5Char"/>
+    <w:basedOn w:val="Normal"/>
+    <w:next w:val="Normal"/>
+    <w:link w:val="Heading5Char"/>
     <w:uiPriority w:val="9"/>
     <w:semiHidden/>
     <w:unhideWhenUsed/>
@@ -855,11 +997,11 @@
       <w:color w:val="0F4761" w:themeColor="accent1" w:themeShade="BF"/>
     </w:rPr>
   </w:style>
-  <w:style w:type="paragraph" w:styleId="Otsikko6">
+  <w:style w:type="paragraph" w:styleId="Heading6">
     <w:name w:val="heading 6"/>
-    <w:basedOn w:val="Normaali"/>
-    <w:next w:val="Normaali"/>
-    <w:link w:val="Otsikko6Char"/>
+    <w:basedOn w:val="Normal"/>
+    <w:next w:val="Normal"/>
+    <w:link w:val="Heading6Char"/>
     <w:uiPriority w:val="9"/>
     <w:semiHidden/>
     <w:unhideWhenUsed/>
@@ -878,11 +1020,11 @@
       <w:color w:val="595959" w:themeColor="text1" w:themeTint="A6"/>
     </w:rPr>
   </w:style>
-  <w:style w:type="paragraph" w:styleId="Otsikko7">
+  <w:style w:type="paragraph" w:styleId="Heading7">
     <w:name w:val="heading 7"/>
-    <w:basedOn w:val="Normaali"/>
-    <w:next w:val="Normaali"/>
-    <w:link w:val="Otsikko7Char"/>
+    <w:basedOn w:val="Normal"/>
+    <w:next w:val="Normal"/>
+    <w:link w:val="Heading7Char"/>
     <w:uiPriority w:val="9"/>
     <w:semiHidden/>
     <w:unhideWhenUsed/>
@@ -899,11 +1041,11 @@
       <w:color w:val="595959" w:themeColor="text1" w:themeTint="A6"/>
     </w:rPr>
   </w:style>
-  <w:style w:type="paragraph" w:styleId="Otsikko8">
+  <w:style w:type="paragraph" w:styleId="Heading8">
     <w:name w:val="heading 8"/>
-    <w:basedOn w:val="Normaali"/>
-    <w:next w:val="Normaali"/>
-    <w:link w:val="Otsikko8Char"/>
+    <w:basedOn w:val="Normal"/>
+    <w:next w:val="Normal"/>
+    <w:link w:val="Heading8Char"/>
     <w:uiPriority w:val="9"/>
     <w:semiHidden/>
     <w:unhideWhenUsed/>
@@ -922,11 +1064,11 @@
       <w:color w:val="272727" w:themeColor="text1" w:themeTint="D8"/>
     </w:rPr>
   </w:style>
-  <w:style w:type="paragraph" w:styleId="Otsikko9">
+  <w:style w:type="paragraph" w:styleId="Heading9">
     <w:name w:val="heading 9"/>
-    <w:basedOn w:val="Normaali"/>
-    <w:next w:val="Normaali"/>
-    <w:link w:val="Otsikko9Char"/>
+    <w:basedOn w:val="Normal"/>
+    <w:next w:val="Normal"/>
+    <w:link w:val="Heading9Char"/>
     <w:uiPriority w:val="9"/>
     <w:semiHidden/>
     <w:unhideWhenUsed/>
@@ -943,13 +1085,13 @@
       <w:color w:val="272727" w:themeColor="text1" w:themeTint="D8"/>
     </w:rPr>
   </w:style>
-  <w:style w:type="character" w:default="1" w:styleId="Kappaleenoletusfontti">
+  <w:style w:type="character" w:default="1" w:styleId="DefaultParagraphFont">
     <w:name w:val="Default Paragraph Font"/>
     <w:uiPriority w:val="1"/>
     <w:semiHidden/>
     <w:unhideWhenUsed/>
   </w:style>
-  <w:style w:type="table" w:default="1" w:styleId="Normaalitaulukko">
+  <w:style w:type="table" w:default="1" w:styleId="TableNormal">
     <w:name w:val="Normal Table"/>
     <w:uiPriority w:val="99"/>
     <w:semiHidden/>
@@ -964,16 +1106,16 @@
       </w:tblCellMar>
     </w:tblPr>
   </w:style>
-  <w:style w:type="numbering" w:default="1" w:styleId="Eiluetteloa">
+  <w:style w:type="numbering" w:default="1" w:styleId="NoList">
     <w:name w:val="No List"/>
     <w:uiPriority w:val="99"/>
     <w:semiHidden/>
     <w:unhideWhenUsed/>
   </w:style>
-  <w:style w:type="character" w:customStyle="1" w:styleId="Otsikko1Char">
-    <w:name w:val="Otsikko 1 Char"/>
-    <w:basedOn w:val="Kappaleenoletusfontti"/>
-    <w:link w:val="Otsikko1"/>
+  <w:style w:type="character" w:customStyle="1" w:styleId="Heading1Char">
+    <w:name w:val="Heading 1 Char"/>
+    <w:basedOn w:val="DefaultParagraphFont"/>
+    <w:link w:val="Heading1"/>
     <w:uiPriority w:val="9"/>
     <w:rsid w:val="00523D16"/>
     <w:rPr>
@@ -984,10 +1126,10 @@
       <w:lang w:val="fi-FI"/>
     </w:rPr>
   </w:style>
-  <w:style w:type="character" w:customStyle="1" w:styleId="Otsikko2Char">
-    <w:name w:val="Otsikko 2 Char"/>
-    <w:basedOn w:val="Kappaleenoletusfontti"/>
-    <w:link w:val="Otsikko2"/>
+  <w:style w:type="character" w:customStyle="1" w:styleId="Heading2Char">
+    <w:name w:val="Heading 2 Char"/>
+    <w:basedOn w:val="DefaultParagraphFont"/>
+    <w:link w:val="Heading2"/>
     <w:uiPriority w:val="9"/>
     <w:rsid w:val="00523D16"/>
     <w:rPr>
@@ -998,10 +1140,10 @@
       <w:lang w:val="fi-FI"/>
     </w:rPr>
   </w:style>
-  <w:style w:type="character" w:customStyle="1" w:styleId="Otsikko3Char">
-    <w:name w:val="Otsikko 3 Char"/>
-    <w:basedOn w:val="Kappaleenoletusfontti"/>
-    <w:link w:val="Otsikko3"/>
+  <w:style w:type="character" w:customStyle="1" w:styleId="Heading3Char">
+    <w:name w:val="Heading 3 Char"/>
+    <w:basedOn w:val="DefaultParagraphFont"/>
+    <w:link w:val="Heading3"/>
     <w:uiPriority w:val="9"/>
     <w:rsid w:val="00523D16"/>
     <w:rPr>
@@ -1012,10 +1154,10 @@
       <w:lang w:val="fi-FI"/>
     </w:rPr>
   </w:style>
-  <w:style w:type="character" w:customStyle="1" w:styleId="Otsikko4Char">
-    <w:name w:val="Otsikko 4 Char"/>
-    <w:basedOn w:val="Kappaleenoletusfontti"/>
-    <w:link w:val="Otsikko4"/>
+  <w:style w:type="character" w:customStyle="1" w:styleId="Heading4Char">
+    <w:name w:val="Heading 4 Char"/>
+    <w:basedOn w:val="DefaultParagraphFont"/>
+    <w:link w:val="Heading4"/>
     <w:uiPriority w:val="9"/>
     <w:semiHidden/>
     <w:rsid w:val="00523D16"/>
@@ -1027,10 +1169,10 @@
       <w:lang w:val="fi-FI"/>
     </w:rPr>
   </w:style>
-  <w:style w:type="character" w:customStyle="1" w:styleId="Otsikko5Char">
-    <w:name w:val="Otsikko 5 Char"/>
-    <w:basedOn w:val="Kappaleenoletusfontti"/>
-    <w:link w:val="Otsikko5"/>
+  <w:style w:type="character" w:customStyle="1" w:styleId="Heading5Char">
+    <w:name w:val="Heading 5 Char"/>
+    <w:basedOn w:val="DefaultParagraphFont"/>
+    <w:link w:val="Heading5"/>
     <w:uiPriority w:val="9"/>
     <w:semiHidden/>
     <w:rsid w:val="00523D16"/>
@@ -1040,10 +1182,10 @@
       <w:lang w:val="fi-FI"/>
     </w:rPr>
   </w:style>
-  <w:style w:type="character" w:customStyle="1" w:styleId="Otsikko6Char">
-    <w:name w:val="Otsikko 6 Char"/>
-    <w:basedOn w:val="Kappaleenoletusfontti"/>
-    <w:link w:val="Otsikko6"/>
+  <w:style w:type="character" w:customStyle="1" w:styleId="Heading6Char">
+    <w:name w:val="Heading 6 Char"/>
+    <w:basedOn w:val="DefaultParagraphFont"/>
+    <w:link w:val="Heading6"/>
     <w:uiPriority w:val="9"/>
     <w:semiHidden/>
     <w:rsid w:val="00523D16"/>
@@ -1055,10 +1197,10 @@
       <w:lang w:val="fi-FI"/>
     </w:rPr>
   </w:style>
-  <w:style w:type="character" w:customStyle="1" w:styleId="Otsikko7Char">
-    <w:name w:val="Otsikko 7 Char"/>
-    <w:basedOn w:val="Kappaleenoletusfontti"/>
-    <w:link w:val="Otsikko7"/>
+  <w:style w:type="character" w:customStyle="1" w:styleId="Heading7Char">
+    <w:name w:val="Heading 7 Char"/>
+    <w:basedOn w:val="DefaultParagraphFont"/>
+    <w:link w:val="Heading7"/>
     <w:uiPriority w:val="9"/>
     <w:semiHidden/>
     <w:rsid w:val="00523D16"/>
@@ -1068,10 +1210,10 @@
       <w:lang w:val="fi-FI"/>
     </w:rPr>
   </w:style>
-  <w:style w:type="character" w:customStyle="1" w:styleId="Otsikko8Char">
-    <w:name w:val="Otsikko 8 Char"/>
-    <w:basedOn w:val="Kappaleenoletusfontti"/>
-    <w:link w:val="Otsikko8"/>
+  <w:style w:type="character" w:customStyle="1" w:styleId="Heading8Char">
+    <w:name w:val="Heading 8 Char"/>
+    <w:basedOn w:val="DefaultParagraphFont"/>
+    <w:link w:val="Heading8"/>
     <w:uiPriority w:val="9"/>
     <w:semiHidden/>
     <w:rsid w:val="00523D16"/>
@@ -1083,10 +1225,10 @@
       <w:lang w:val="fi-FI"/>
     </w:rPr>
   </w:style>
-  <w:style w:type="character" w:customStyle="1" w:styleId="Otsikko9Char">
-    <w:name w:val="Otsikko 9 Char"/>
-    <w:basedOn w:val="Kappaleenoletusfontti"/>
-    <w:link w:val="Otsikko9"/>
+  <w:style w:type="character" w:customStyle="1" w:styleId="Heading9Char">
+    <w:name w:val="Heading 9 Char"/>
+    <w:basedOn w:val="DefaultParagraphFont"/>
+    <w:link w:val="Heading9"/>
     <w:uiPriority w:val="9"/>
     <w:semiHidden/>
     <w:rsid w:val="00523D16"/>
@@ -1096,11 +1238,11 @@
       <w:lang w:val="fi-FI"/>
     </w:rPr>
   </w:style>
-  <w:style w:type="paragraph" w:styleId="Otsikko">
+  <w:style w:type="paragraph" w:styleId="Title">
     <w:name w:val="Title"/>
-    <w:basedOn w:val="Normaali"/>
-    <w:next w:val="Normaali"/>
-    <w:link w:val="OtsikkoChar"/>
+    <w:basedOn w:val="Normal"/>
+    <w:next w:val="Normal"/>
+    <w:link w:val="TitleChar"/>
     <w:uiPriority w:val="10"/>
     <w:qFormat/>
     <w:rsid w:val="00523D16"/>
@@ -1116,10 +1258,10 @@
       <w:szCs w:val="56"/>
     </w:rPr>
   </w:style>
-  <w:style w:type="character" w:customStyle="1" w:styleId="OtsikkoChar">
-    <w:name w:val="Otsikko Char"/>
-    <w:basedOn w:val="Kappaleenoletusfontti"/>
-    <w:link w:val="Otsikko"/>
+  <w:style w:type="character" w:customStyle="1" w:styleId="TitleChar">
+    <w:name w:val="Title Char"/>
+    <w:basedOn w:val="DefaultParagraphFont"/>
+    <w:link w:val="Title"/>
     <w:uiPriority w:val="10"/>
     <w:rsid w:val="00523D16"/>
     <w:rPr>
@@ -1131,11 +1273,11 @@
       <w:lang w:val="fi-FI"/>
     </w:rPr>
   </w:style>
-  <w:style w:type="paragraph" w:styleId="Alaotsikko">
+  <w:style w:type="paragraph" w:styleId="Subtitle">
     <w:name w:val="Subtitle"/>
-    <w:basedOn w:val="Normaali"/>
-    <w:next w:val="Normaali"/>
-    <w:link w:val="AlaotsikkoChar"/>
+    <w:basedOn w:val="Normal"/>
+    <w:next w:val="Normal"/>
+    <w:link w:val="SubtitleChar"/>
     <w:uiPriority w:val="11"/>
     <w:qFormat/>
     <w:rsid w:val="00523D16"/>
@@ -1152,10 +1294,10 @@
       <w:szCs w:val="28"/>
     </w:rPr>
   </w:style>
-  <w:style w:type="character" w:customStyle="1" w:styleId="AlaotsikkoChar">
-    <w:name w:val="Alaotsikko Char"/>
-    <w:basedOn w:val="Kappaleenoletusfontti"/>
-    <w:link w:val="Alaotsikko"/>
+  <w:style w:type="character" w:customStyle="1" w:styleId="SubtitleChar">
+    <w:name w:val="Subtitle Char"/>
+    <w:basedOn w:val="DefaultParagraphFont"/>
+    <w:link w:val="Subtitle"/>
     <w:uiPriority w:val="11"/>
     <w:rsid w:val="00523D16"/>
     <w:rPr>
@@ -1167,11 +1309,11 @@
       <w:lang w:val="fi-FI"/>
     </w:rPr>
   </w:style>
-  <w:style w:type="paragraph" w:styleId="Lainaus">
+  <w:style w:type="paragraph" w:styleId="Quote">
     <w:name w:val="Quote"/>
-    <w:basedOn w:val="Normaali"/>
-    <w:next w:val="Normaali"/>
-    <w:link w:val="LainausChar"/>
+    <w:basedOn w:val="Normal"/>
+    <w:next w:val="Normal"/>
+    <w:link w:val="QuoteChar"/>
     <w:uiPriority w:val="29"/>
     <w:qFormat/>
     <w:rsid w:val="00523D16"/>
@@ -1185,10 +1327,10 @@
       <w:color w:val="404040" w:themeColor="text1" w:themeTint="BF"/>
     </w:rPr>
   </w:style>
-  <w:style w:type="character" w:customStyle="1" w:styleId="LainausChar">
-    <w:name w:val="Lainaus Char"/>
-    <w:basedOn w:val="Kappaleenoletusfontti"/>
-    <w:link w:val="Lainaus"/>
+  <w:style w:type="character" w:customStyle="1" w:styleId="QuoteChar">
+    <w:name w:val="Quote Char"/>
+    <w:basedOn w:val="DefaultParagraphFont"/>
+    <w:link w:val="Quote"/>
     <w:uiPriority w:val="29"/>
     <w:rsid w:val="00523D16"/>
     <w:rPr>
@@ -1198,9 +1340,9 @@
       <w:lang w:val="fi-FI"/>
     </w:rPr>
   </w:style>
-  <w:style w:type="paragraph" w:styleId="Luettelokappale">
+  <w:style w:type="paragraph" w:styleId="ListParagraph">
     <w:name w:val="List Paragraph"/>
-    <w:basedOn w:val="Normaali"/>
+    <w:basedOn w:val="Normal"/>
     <w:uiPriority w:val="34"/>
     <w:qFormat/>
     <w:rsid w:val="00523D16"/>
@@ -1209,9 +1351,9 @@
       <w:contextualSpacing/>
     </w:pPr>
   </w:style>
-  <w:style w:type="character" w:styleId="Voimakaskorostus">
+  <w:style w:type="character" w:styleId="IntenseEmphasis">
     <w:name w:val="Intense Emphasis"/>
-    <w:basedOn w:val="Kappaleenoletusfontti"/>
+    <w:basedOn w:val="DefaultParagraphFont"/>
     <w:uiPriority w:val="21"/>
     <w:qFormat/>
     <w:rsid w:val="00523D16"/>
@@ -1221,11 +1363,11 @@
       <w:color w:val="0F4761" w:themeColor="accent1" w:themeShade="BF"/>
     </w:rPr>
   </w:style>
-  <w:style w:type="paragraph" w:styleId="Erottuvalainaus">
+  <w:style w:type="paragraph" w:styleId="IntenseQuote">
     <w:name w:val="Intense Quote"/>
-    <w:basedOn w:val="Normaali"/>
-    <w:next w:val="Normaali"/>
-    <w:link w:val="ErottuvalainausChar"/>
+    <w:basedOn w:val="Normal"/>
+    <w:next w:val="Normal"/>
+    <w:link w:val="IntenseQuoteChar"/>
     <w:uiPriority w:val="30"/>
     <w:qFormat/>
     <w:rsid w:val="00523D16"/>
@@ -1244,10 +1386,10 @@
       <w:color w:val="0F4761" w:themeColor="accent1" w:themeShade="BF"/>
     </w:rPr>
   </w:style>
-  <w:style w:type="character" w:customStyle="1" w:styleId="ErottuvalainausChar">
-    <w:name w:val="Erottuva lainaus Char"/>
-    <w:basedOn w:val="Kappaleenoletusfontti"/>
-    <w:link w:val="Erottuvalainaus"/>
+  <w:style w:type="character" w:customStyle="1" w:styleId="IntenseQuoteChar">
+    <w:name w:val="Intense Quote Char"/>
+    <w:basedOn w:val="DefaultParagraphFont"/>
+    <w:link w:val="IntenseQuote"/>
     <w:uiPriority w:val="30"/>
     <w:rsid w:val="00523D16"/>
     <w:rPr>
@@ -1257,9 +1399,9 @@
       <w:lang w:val="fi-FI"/>
     </w:rPr>
   </w:style>
-  <w:style w:type="character" w:styleId="Erottuvaviittaus">
+  <w:style w:type="character" w:styleId="IntenseReference">
     <w:name w:val="Intense Reference"/>
-    <w:basedOn w:val="Kappaleenoletusfontti"/>
+    <w:basedOn w:val="DefaultParagraphFont"/>
     <w:uiPriority w:val="32"/>
     <w:qFormat/>
     <w:rsid w:val="00523D16"/>

</xml_diff>